<commit_message>
feat: add new and edit new and delete new
</commit_message>
<xml_diff>
--- a/src/main/webapp/resources/content/N1.docx
+++ b/src/main/webapp/resources/content/N1.docx
@@ -27,6 +27,8 @@
           <w:szCs w:val="24"/>
         </w:rPr>
       </w:pPr>
+      <w:bookmarkStart w:id="0" w:name="_GoBack"/>
+      <w:bookmarkEnd w:id="0"/>
     </w:p>
     <w:p>
       <w:pPr>
@@ -110,7 +112,6 @@
           <w:szCs w:val="24"/>
         </w:rPr>
       </w:pPr>
-      <w:bookmarkStart w:id="0" w:name="_GoBack"/>
       <w:r>
         <w:rPr>
           <w:rFonts w:hint="default" w:ascii="Times New Roman" w:hAnsi="Times New Roman" w:eastAsia="SimSun" w:cs="Times New Roman"/>
@@ -159,7 +160,6 @@
           </wp:inline>
         </w:drawing>
       </w:r>
-      <w:bookmarkEnd w:id="0"/>
     </w:p>
     <w:p>
       <w:pPr>
@@ -735,6 +735,7 @@
       <w:jc w:val="left"/>
     </w:pPr>
     <w:rPr>
+      <w:rFonts w:ascii="Times New Roman" w:hAnsi="Times New Roman" w:eastAsia="SimSun" w:cs="Times New Roman"/>
       <w:kern w:val="0"/>
       <w:sz w:val="24"/>
       <w:szCs w:val="24"/>

</xml_diff>